<commit_message>
chore: sync all pending files to public repo + P17 natural experiment fix
Includes: 3 handoff docs, grant roadmap, masterpiece notes, P11 Archipel
figures (JPEG), P17 ArchCalc submission package (4 files + scripts),
P17 "natural experiment"→"before-after observation" (same fix as P11 v0.6),
JCAA waiver reply, misc doc updates from sessions 10-12.

Co-Authored-By: Claude Opus 4.6 (1M context) <noreply@anthropic.com>
</commit_message>
<xml_diff>
--- a/papers/P17_two_javas/archcalc_submission/P17_manuscript.docx
+++ b/papers/P17_two_javas/archcalc_submission/P17_manuscript.docx
@@ -49,7 +49,7 @@
         <w:t xml:space="preserve"> </w:t>
       </w:r>
       <w:r>
-        <w:t xml:space="preserve">This paper demonstrates that the record is not uniform but spatially structured along volcanic distance gradients.</w:t>
+        <w:t xml:space="preserve">This paper demonstrates that the record is spatially structured along volcanic distance gradients.</w:t>
       </w:r>
       <w:r>
         <w:t xml:space="preserve"> </w:t>
@@ -200,13 +200,13 @@
         <w:t xml:space="preserve"> </w:t>
       </w:r>
       <w:r>
-        <w:t xml:space="preserve">These findings demonstrate that inscription counts cannot serve as proxies for population density without accounting for the spatial structure of archaeological bias.</w:t>
-      </w:r>
-      <w:r>
-        <w:t xml:space="preserve"> </w:t>
-      </w:r>
-      <w:r>
-        <w:t xml:space="preserve">What scholarship calls</w:t>
+        <w:t xml:space="preserve">Inscription counts cannot serve as proxies for population density without accounting for this spatial bias.</w:t>
+      </w:r>
+      <w:r>
+        <w:t xml:space="preserve"> </w:t>
+      </w:r>
+      <w:r>
+        <w:t xml:space="preserve">The textual record of</w:t>
       </w:r>
       <w:r>
         <w:t xml:space="preserve"> </w:t>
@@ -218,7 +218,7 @@
         <w:t xml:space="preserve"> </w:t>
       </w:r>
       <w:r>
-        <w:t xml:space="preserve">was a 15-kilometre-wide phenomenon centred on the fertile volcanic plains—not a civilization-wide transformation.</w:t>
+        <w:t xml:space="preserve">was a 15-kilometre-wide court phenomenon, not a civilisation-wide transformation.</w:t>
       </w:r>
     </w:p>
     <w:p>
@@ -253,7 +253,7 @@
         <w:pStyle w:val="FirstParagraph"/>
       </w:pPr>
       <w:r>
-        <w:t xml:space="preserve">Indonesian archaeology operates under an implicit assumption of uniform darkness: the record before 400 CE is sparse everywhere, and the Hindu-Buddhist period (5th–15th centuries) represents a civilization-wide transformation.</w:t>
+        <w:t xml:space="preserve">Indonesian archaeology operates under an implicit assumption of uniform darkness: the record before 400 CE is sparse everywhere, and the Hindu-Buddhist period (5th–15th centuries) represents a civilisation-wide transformation.</w:t>
       </w:r>
       <w:r>
         <w:t xml:space="preserve"> </w:t>
@@ -319,7 +319,7 @@
         <w:t xml:space="preserve"> </w:t>
       </w:r>
       <w:r>
-        <w:t xml:space="preserve">The regions of Java where inscriptions are abundant—the Prambanan plain, the Solo valley, the Brantas basin—are treated as centres of civilisation; the regions where inscriptions are scarce are treated as peripheries or hinterlands.</w:t>
+        <w:t xml:space="preserve">The regions of Java where inscriptions are abundant – the Prambanan plain, the Solo valley, the Brantas basin – are treated as centres of civilisation; the regions where inscriptions are scarce are treated as peripheries or hinterlands.</w:t>
       </w:r>
     </w:p>
     <w:p>
@@ -339,7 +339,7 @@
         <w:t xml:space="preserve"> </w:t>
       </w:r>
       <w:r>
-        <w:t xml:space="preserve">The median gap between these two archaeological populations—13 kilometres—represents not a gradual transition but a fundamental division between two modes of cultural production: one physical and relatively indigenous, the other textual and heavily Sanskritized.</w:t>
+        <w:t xml:space="preserve">The median gap between these two archaeological populations – 13 kilometres – represents not a gradual transition but a fundamental division between two modes of cultural production: one physical and relatively indigenous, the other textual and heavily Sanskritized.</w:t>
       </w:r>
     </w:p>
     <w:p>
@@ -422,7 +422,7 @@
         <w:pStyle w:val="BodyText"/>
       </w:pPr>
       <w:r>
-        <w:t xml:space="preserve">We present five mutually reinforcing analyses drawn from a suite of 162 computational experiments:</w:t>
+        <w:t xml:space="preserve">We present five mutually reinforcing analyses drawn from a suite of 175 computational experiments:</w:t>
       </w:r>
     </w:p>
     <w:p>
@@ -1178,7 +1178,7 @@
               <w:jc w:val="left"/>
             </w:pPr>
             <w:r>
-              <w:t xml:space="preserve">—</w:t>
+              <w:t xml:space="preserve">–</w:t>
             </w:r>
           </w:p>
         </w:tc>
@@ -1398,7 +1398,7 @@
         <w:t xml:space="preserve"> </w:t>
       </w:r>
       <w:r>
-        <w:t xml:space="preserve">As de Casparis noted, inscriptions cluster in areas associated with court activity—the Kedu, Prambanan, and Brantas plains—while the volcanic highlands and coastal lowlands are comparatively inscription-free</w:t>
+        <w:t xml:space="preserve">As de Casparis noted, inscriptions cluster in areas associated with court activity – the Kedu, Prambanan, and Brantas plains – while the volcanic highlands and coastal lowlands are comparatively inscription-free</w:t>
       </w:r>
       <w:r>
         <w:t xml:space="preserve"> </w:t>
@@ -1546,7 +1546,7 @@
         <w:t xml:space="preserve"> </w:t>
       </w:r>
       <w:r>
-        <w:t xml:space="preserve">The causes remain debated—Merapi eruptions, political conflict, economic reorganisation—but the consequences for the inscriptional record are clear</w:t>
+        <w:t xml:space="preserve">The causes remain debated – Merapi eruptions, political conflict, economic reorganisation – but the consequences for the inscriptional record are clear</w:t>
       </w:r>
       <w:r>
         <w:t xml:space="preserve"> </w:t>
@@ -1566,7 +1566,7 @@
         <w:t xml:space="preserve"> </w:t>
       </w:r>
       <w:r>
-        <w:t xml:space="preserve">After 929 CE, inscriptions appear in East Java—the Brantas valley, the Malang plateau—and their vocabulary shifts dramatically toward Old Javanese with indigenous terminology.</w:t>
+        <w:t xml:space="preserve">After 929 CE, inscriptions appear in East Java – the Brantas valley, the Malang plateau – and their vocabulary shifts dramatically toward Old Javanese with indigenous terminology.</w:t>
       </w:r>
       <w:r>
         <w:t xml:space="preserve"> </w:t>
@@ -1903,7 +1903,19 @@
         <w:t xml:space="preserve"> </w:t>
       </w:r>
       <w:r>
-        <w:t xml:space="preserve">The 15 km and 30 km thresholds were chosen empirically based on the observed distribution breaks in both candi and inscription populations, and correspond approximately to the transition from proximal volcanic hazard zones to distal alluvial plains.</w:t>
+        <w:t xml:space="preserve">The 15 km and 30 km thresholds correspond to established volcanological boundaries: 15 km approximates the limit of proximal volcanic hazard zones (lahar channels, pyroclastic density currents), while 30 km marks the transition to distal alluvial plains</w:t>
+      </w:r>
+      <w:r>
+        <w:t xml:space="preserve"> </w:t>
+      </w:r>
+      <w:r>
+        <w:t xml:space="preserve">.</w:t>
+      </w:r>
+      <w:r>
+        <w:t xml:space="preserve"> </w:t>
+      </w:r>
+      <w:r>
+        <w:t xml:space="preserve">These boundaries also coincide with observed distribution breaks in both candi and inscription populations.</w:t>
       </w:r>
     </w:p>
     <w:p>
@@ -2013,6 +2025,12 @@
       </w:r>
       <w:r>
         <w:t xml:space="preserve">Partial correlation controlling for inscription length (word count) was computed via residualisation to address the confound that longer inscriptions mechanically contain more vocabulary of all types.</w:t>
+      </w:r>
+      <w:r>
+        <w:t xml:space="preserve"> </w:t>
+      </w:r>
+      <w:r>
+        <w:t xml:space="preserve">Semantic discontinuity at 929 CE was tested independently using sentence-transformer embeddings (all-MiniLM-L6-v2, 768 dimensions) of 127 translated inscriptions, with significance assessed via permutation-based distance testing (10,000 permutations).</w:t>
       </w:r>
       <w:r>
         <w:t xml:space="preserve"> </w:t>
@@ -2057,7 +2075,7 @@
         </w:r>
       </w:hyperlink>
       <w:r>
-        <w:t xml:space="preserve">, Figure </w:t>
+        <w:t xml:space="preserve">, Fig. </w:t>
       </w:r>
       <w:hyperlink w:anchor="fig:histogram">
         <w:r>
@@ -2834,7 +2852,7 @@
         <w:t xml:space="preserve"> </w:t>
       </w:r>
       <w:r>
-        <w:t xml:space="preserve">Instead, site density increases monotonically with elevation (Figure </w:t>
+        <w:t xml:space="preserve">Instead, site density increases monotonically with elevation (Fig. </w:t>
       </w:r>
       <w:hyperlink w:anchor="fig:elevation">
         <w:r>
@@ -2952,7 +2970,7 @@
         </m:r>
       </m:oMath>
       <w:r>
-        <w:t xml:space="preserve">1000 m—a 9.5-fold increase. The expected inverse-U pattern is absent.</w:t>
+        <w:t xml:space="preserve">1000 m – a 9.5-fold increase. The expected inverse-U pattern is absent.</w:t>
       </w:r>
     </w:p>
     <w:bookmarkEnd w:id="28"/>
@@ -3021,7 +3039,7 @@
         <w:t xml:space="preserve"> </w:t>
       </w:r>
       <w:r>
-        <w:t xml:space="preserve">This means the visible archaeological record is dominated by high-elevation volcano-slope sites—not by</w:t>
+        <w:t xml:space="preserve">This means the visible archaeological record is dominated by high-elevation volcano-slope sites – not by</w:t>
       </w:r>
       <w:r>
         <w:t xml:space="preserve"> </w:t>
@@ -3273,7 +3291,7 @@
         </m:r>
       </m:oMath>
       <w:r>
-        <w:t xml:space="preserve">2 m) to 56.4% in deep zones (5–10 m)—a 5.8-fold increase. Sanskrit vocabulary shows the inverse pattern.</w:t>
+        <w:t xml:space="preserve">2 m) to 56.4% in deep zones (5–10 m) – a 5.8-fold increase. Sanskrit vocabulary shows the inverse pattern.</w:t>
       </w:r>
     </w:p>
     <w:bookmarkEnd w:id="33"/>
@@ -3389,7 +3407,7 @@
         <w:pStyle w:val="BodyText"/>
       </w:pPr>
       <w:r>
-        <w:t xml:space="preserve">Depth-binned profiles are dramatic (Figure </w:t>
+        <w:t xml:space="preserve">Depth-binned profiles are dramatic (Fig. </w:t>
       </w:r>
       <w:hyperlink w:anchor="fig:depth">
         <w:r>
@@ -3411,7 +3429,7 @@
         </m:r>
       </m:oMath>
       <w:r>
-        <w:t xml:space="preserve">2 m) have 9.3% indigenous vocabulary, while deep-burial zones (5–10 m) have 56.4%—a 5.8-fold increase.</w:t>
+        <w:t xml:space="preserve">2 m) have 9.3% indigenous vocabulary, while deep-burial zones (5–10 m) have 56.4% – a 5.8-fold increase.</w:t>
       </w:r>
       <w:r>
         <w:t xml:space="preserve"> </w:t>
@@ -3424,6 +3442,88 @@
       </w:r>
       <w:r>
         <w:t xml:space="preserve">The inscriptions hidden deepest beneath tephra and lahar deposits are precisely those most rich in pre-Sanskrit vocabulary.</w:t>
+      </w:r>
+    </w:p>
+    <w:p>
+      <w:pPr>
+        <w:pStyle w:val="BodyText"/>
+      </w:pPr>
+      <w:r>
+        <w:t xml:space="preserve">We note that burial depth and volcanic distance are themselves correlated: deeper burial occurs nearer to volcanoes.</w:t>
+      </w:r>
+      <w:r>
+        <w:t xml:space="preserve"> </w:t>
+      </w:r>
+      <w:r>
+        <w:t xml:space="preserve">The indigenous vocabulary ratio also correlates directly with volcanic proximity (</w:t>
+      </w:r>
+      <m:oMath>
+        <m:r>
+          <m:t>ρ</m:t>
+        </m:r>
+        <m:r>
+          <m:rPr>
+            <m:sty m:val="p"/>
+          </m:rPr>
+          <m:t>=</m:t>
+        </m:r>
+        <m:r>
+          <m:rPr>
+            <m:sty m:val="p"/>
+          </m:rPr>
+          <m:t>−</m:t>
+        </m:r>
+        <m:r>
+          <m:t>0.295</m:t>
+        </m:r>
+      </m:oMath>
+      <w:r>
+        <w:t xml:space="preserve">,</w:t>
+      </w:r>
+      <w:r>
+        <w:t xml:space="preserve"> </w:t>
+      </w:r>
+      <m:oMath>
+        <m:r>
+          <m:t>p</m:t>
+        </m:r>
+        <m:r>
+          <m:rPr>
+            <m:sty m:val="p"/>
+          </m:rPr>
+          <m:t>=</m:t>
+        </m:r>
+        <m:r>
+          <m:t>0.0002</m:t>
+        </m:r>
+      </m:oMath>
+      <w:r>
+        <w:t xml:space="preserve">).</w:t>
+      </w:r>
+      <w:r>
+        <w:t xml:space="preserve"> </w:t>
+      </w:r>
+      <w:r>
+        <w:t xml:space="preserve">The depth–vocabulary correlation may therefore be driven partly by geography rather than by depth</w:t>
+      </w:r>
+      <w:r>
+        <w:t xml:space="preserve"> </w:t>
+      </w:r>
+      <w:r>
+        <w:rPr>
+          <w:i/>
+          <w:iCs/>
+        </w:rPr>
+        <w:t xml:space="preserve">per se</w:t>
+      </w:r>
+      <w:r>
+        <w:t xml:space="preserve">: inscriptions near volcanoes describe local landscapes in indigenous terms and happen to be located where burial is deepest.</w:t>
+      </w:r>
+      <w:r>
+        <w:t xml:space="preserve"> </w:t>
+      </w:r>
+      <w:r>
+        <w:t xml:space="preserve">The practical implication for the Two Javas model is unchanged – the most culturally indigenous content is concentrated precisely where volcanic processes most effectively conceal it – but the causal pathway runs through volcanic proximity rather than depth alone.</w:t>
       </w:r>
     </w:p>
     <w:bookmarkEnd w:id="34"/>
@@ -3500,7 +3600,7 @@
         <w:t xml:space="preserve"> </w:t>
       </w:r>
       <w:r>
-        <w:t xml:space="preserve">by the court zone (Figure </w:t>
+        <w:t xml:space="preserve">by the court zone (Fig. </w:t>
       </w:r>
       <w:hyperlink w:anchor="fig:temporal">
         <w:r>
@@ -3586,7 +3686,7 @@
         <w:t xml:space="preserve"> </w:t>
       </w:r>
       <w:r>
-        <w:t xml:space="preserve">—</w:t>
+        <w:t xml:space="preserve">–</w:t>
       </w:r>
       <w:r>
         <w:t xml:space="preserve"> </w:t>
@@ -3660,7 +3760,7 @@
         <w:t xml:space="preserve"> </w:t>
       </w:r>
       <w:r>
-        <w:t xml:space="preserve">—</w:t>
+        <w:t xml:space="preserve">–</w:t>
       </w:r>
       <w:r>
         <w:t xml:space="preserve"> </w:t>
@@ -3745,7 +3845,7 @@
         <w:t xml:space="preserve"> </w:t>
       </w:r>
       <w:r>
-        <w:t xml:space="preserve">—</w:t>
+        <w:t xml:space="preserve">–</w:t>
       </w:r>
       <w:r>
         <w:t xml:space="preserve"> </w:t>
@@ -3950,7 +4050,7 @@
         <w:t xml:space="preserve"> </w:t>
       </w:r>
       <w:r>
-        <w:t xml:space="preserve">The volcano zone and the periphery—which together comprise the majority of Java’s area—show no temporal vocabulary trend because their inscriptions were always relatively indigenous.</w:t>
+        <w:t xml:space="preserve">The volcano zone and the periphery – which together comprise the majority of Java’s area – show no temporal vocabulary trend because their inscriptions were always relatively indigenous.</w:t>
       </w:r>
     </w:p>
     <w:bookmarkEnd w:id="39"/>
@@ -3974,7 +4074,7 @@
         <w:t xml:space="preserve"> </w:t>
       </w:r>
       <w:r>
-        <w:t xml:space="preserve">After 929 CE, 53% of inscriptions are in the periphery, and 89% of those are mixed or indigenous-rich (Figure </w:t>
+        <w:t xml:space="preserve">After 929 CE, 53% of inscriptions are in the periphery, and 89% of those are mixed or indigenous-rich (Fig. </w:t>
       </w:r>
       <w:hyperlink w:anchor="fig:pre_post">
         <w:r>
@@ -4050,7 +4150,7 @@
         <w:pStyle w:val="BodyText"/>
       </w:pPr>
       <w:r>
-        <w:t xml:space="preserve">The collapse of the Mataram court system did not merely change the content of inscriptions—it changed their geography.</w:t>
+        <w:t xml:space="preserve">The collapse of the Mataram court system did not merely change the content of inscriptions – it changed their geography.</w:t>
       </w:r>
       <w:r>
         <w:t xml:space="preserve"> </w:t>
@@ -4114,7 +4214,7 @@
         <w:t xml:space="preserve"> </w:t>
       </w:r>
       <w:r>
-        <w:t xml:space="preserve">(0–15 km from active volcanoes) is a landscape of sacred architecture—candi built on slopes as expressions of cosmological geography—with relatively indigenous vocabulary and progressive volcanic burial at rates sufficient to conceal entire temple complexes within centuries.</w:t>
+        <w:t xml:space="preserve">(0–15 km from active volcanoes) is a landscape of sacred architecture – candi built on slopes as expressions of cosmological geography – with relatively indigenous vocabulary and progressive volcanic burial at rates sufficient to conceal entire temple complexes within centuries.</w:t>
       </w:r>
       <w:r>
         <w:t xml:space="preserve"> </w:t>
@@ -4132,7 +4232,7 @@
         <w:t xml:space="preserve"> </w:t>
       </w:r>
       <w:r>
-        <w:t xml:space="preserve">The inscriptions that do occur in this zone are longer, more detailed, and incorporate significantly more indigenous terminology for landscape features—precisely the content that volcanic burial then removes from view.</w:t>
+        <w:t xml:space="preserve">The inscriptions that do occur in this zone are longer, more detailed, and incorporate significantly more indigenous terminology for landscape features – precisely the content that volcanic burial then removes from view.</w:t>
       </w:r>
     </w:p>
     <w:p>
@@ -4150,7 +4250,7 @@
         <w:t xml:space="preserve"> </w:t>
       </w:r>
       <w:r>
-        <w:t xml:space="preserve">(15–30 km) is a landscape of textual administration—inscriptions recording land grants, tax exemptions, and royal genealogies in Sanskrit-heavy formulaic prose.</w:t>
+        <w:t xml:space="preserve">(15–30 km) is a landscape of textual administration – inscriptions recording land grants, tax exemptions, and royal genealogies in Sanskrit-heavy formulaic prose.</w:t>
       </w:r>
       <w:r>
         <w:t xml:space="preserve"> </w:t>
@@ -4162,7 +4262,7 @@
         <w:t xml:space="preserve"> </w:t>
       </w:r>
       <w:r>
-        <w:t xml:space="preserve">Courts established themselves here, and the inscriptional genre—the</w:t>
+        <w:t xml:space="preserve">Courts established themselves here, and the inscriptional genre – the</w:t>
       </w:r>
       <w:r>
         <w:t xml:space="preserve"> </w:t>
@@ -4178,7 +4278,7 @@
         <w:t xml:space="preserve"> </w:t>
       </w:r>
       <w:r>
-        <w:t xml:space="preserve">charter—was their primary mode of record-keeping.</w:t>
+        <w:t xml:space="preserve">charter – was their primary mode of record-keeping.</w:t>
       </w:r>
       <w:r>
         <w:t xml:space="preserve"> </w:t>
@@ -4303,7 +4403,7 @@
         <w:t xml:space="preserve"> </w:t>
       </w:r>
       <w:r>
-        <w:t xml:space="preserve">The 9.5-fold site density increase from coast to mountain demonstrates that even after burial, enough sites are exposed to dominate the visible record—implying that the buried population is vastly larger.</w:t>
+        <w:t xml:space="preserve">The 9.5-fold site density increase from coast to mountain demonstrates that even after burial, enough sites are exposed to dominate the visible record – implying that the buried population is vastly larger.</w:t>
       </w:r>
     </w:p>
     <w:p>
@@ -4377,7 +4477,10 @@
         <w:t xml:space="preserve">“Indianization”</w:t>
       </w:r>
       <w:r>
-        <w:t xml:space="preserve">—the process by which South Asian cultural elements were adopted by Southeast Asian societies—has been debated for decades</w:t>
+        <w:t xml:space="preserve"> </w:t>
+      </w:r>
+      <w:r>
+        <w:t xml:space="preserve">– the process by which South Asian cultural elements were adopted by Southeast Asian societies – has been debated for decades</w:t>
       </w:r>
       <w:r>
         <w:t xml:space="preserve"> </w:t>
@@ -4397,19 +4500,23 @@
         <w:pStyle w:val="BodyText"/>
       </w:pPr>
       <w:r>
-        <w:t xml:space="preserve">What scholarship calls</w:t>
-      </w:r>
-      <w:r>
-        <w:t xml:space="preserve"> </w:t>
-      </w:r>
-      <w:r>
-        <w:t xml:space="preserve">“the Hindu period”</w:t>
-      </w:r>
-      <w:r>
-        <w:t xml:space="preserve"> </w:t>
-      </w:r>
-      <w:r>
-        <w:t xml:space="preserve">or</w:t>
+        <w:t xml:space="preserve">The</w:t>
+      </w:r>
+      <w:r>
+        <w:t xml:space="preserve"> </w:t>
+      </w:r>
+      <w:r>
+        <w:rPr>
+          <w:i/>
+          <w:iCs/>
+        </w:rPr>
+        <w:t xml:space="preserve">textual record</w:t>
+      </w:r>
+      <w:r>
+        <w:t xml:space="preserve"> </w:t>
+      </w:r>
+      <w:r>
+        <w:t xml:space="preserve">of what scholarship calls</w:t>
       </w:r>
       <w:r>
         <w:t xml:space="preserve"> </w:t>
@@ -4427,7 +4534,7 @@
         <w:t xml:space="preserve"> </w:t>
       </w:r>
       <w:r>
-        <w:t xml:space="preserve">Court Java—the zone that produced Sanskrit inscriptions, adopted Indic administrative vocabulary, and generated the textual record from which historians have reconstructed</w:t>
+        <w:t xml:space="preserve">Court Java – the zone that produced Sanskrit inscriptions, adopted Indic administrative vocabulary, and generated the textual record from which historians have reconstructed</w:t>
       </w:r>
       <w:r>
         <w:t xml:space="preserve"> </w:t>
@@ -4436,7 +4543,10 @@
         <w:t xml:space="preserve">“Javanese civilisation”</w:t>
       </w:r>
       <w:r>
-        <w:t xml:space="preserve">—is a narrow band between 15 and 30 kilometres from the nearest major volcano.</w:t>
+        <w:t xml:space="preserve"> </w:t>
+      </w:r>
+      <w:r>
+        <w:t xml:space="preserve">– is a narrow band between 15 and 30 kilometres from the nearest major volcano.</w:t>
       </w:r>
       <w:r>
         <w:t xml:space="preserve"> </w:t>
@@ -4486,7 +4596,7 @@
         <w:t xml:space="preserve"> </w:t>
       </w:r>
       <w:r>
-        <w:t xml:space="preserve">If Indianization were a civilisation-wide transformation—penetrating every social stratum and every geographic zone—its collapse should have affected all zones equally.</w:t>
+        <w:t xml:space="preserve">If Indianization were a civilisation-wide transformation – penetrating every social stratum and every geographic zone – its collapse should have affected all zones equally.</w:t>
       </w:r>
       <w:r>
         <w:t xml:space="preserve"> </w:t>
@@ -4518,7 +4628,7 @@
         <w:t xml:space="preserve"> </w:t>
       </w:r>
       <w:r>
-        <w:t xml:space="preserve">narrative—the idea that Hindu-Buddhist culture gradually faded after Majapahit—is partially misleading.</w:t>
+        <w:t xml:space="preserve">narrative – the idea that Hindu-Buddhist culture gradually faded after Majapahit – is partially misleading.</w:t>
       </w:r>
       <w:r>
         <w:t xml:space="preserve"> </w:t>
@@ -4691,7 +4801,7 @@
         <w:t xml:space="preserve"> </w:t>
       </w:r>
       <w:r>
-        <w:t xml:space="preserve">deposition—repeated small to moderate events (lahars, tephra falls, pyroclastic surges) accumulating over centuries at rates of 2.4–6.2 mm/year</w:t>
+        <w:t xml:space="preserve">deposition – repeated small to moderate events (lahars, tephra falls, pyroclastic surges) accumulating over centuries at rates of 2.4–6.2 mm/year</w:t>
       </w:r>
       <w:r>
         <w:t xml:space="preserve"> </w:t>
@@ -4756,7 +4866,7 @@
         <w:pStyle w:val="BodyText"/>
       </w:pPr>
       <w:r>
-        <w:t xml:space="preserve">The closest comparanda within Java are Sambisari, Kimpulan, and Liyangan—all discovered accidentally and all yielding significant archaeological information despite cumulative rather than catastrophic burial.</w:t>
+        <w:t xml:space="preserve">The closest comparanda within Java are Sambisari, Kimpulan, and Liyangan – all discovered accidentally and all yielding significant archaeological information despite cumulative rather than catastrophic burial.</w:t>
       </w:r>
       <w:r>
         <w:t xml:space="preserve"> </w:t>
@@ -4766,13 +4876,13 @@
       </w:r>
     </w:p>
     <w:bookmarkEnd w:id="50"/>
-    <w:bookmarkStart w:id="51" w:name="cross-regional-validation-bali"/>
+    <w:bookmarkStart w:id="51" w:name="cross-regional-consistency-check"/>
     <w:p>
       <w:pPr>
         <w:pStyle w:val="Heading2"/>
       </w:pPr>
       <w:r>
-        <w:t xml:space="preserve">Cross-regional validation: Bali</w:t>
+        <w:t xml:space="preserve">Cross-regional consistency check</w:t>
       </w:r>
     </w:p>
     <w:p>
@@ -4780,13 +4890,13 @@
         <w:pStyle w:val="FirstParagraph"/>
       </w:pPr>
       <w:r>
-        <w:t xml:space="preserve">An independent test of the Two Javas model comes from Bali, which shares Java’s volcanic geology (2 active volcanoes) but has better archaeological survey coverage.</w:t>
-      </w:r>
-      <w:r>
-        <w:t xml:space="preserve"> </w:t>
-      </w:r>
-      <w:r>
-        <w:t xml:space="preserve">If the model is correct, Bali’s pre-Hindu sites should cluster in non-volcanic zones, and its inscription density should exceed Java’s in proportion to its reduced volcanic burial and improved survey intensity.</w:t>
+        <w:t xml:space="preserve">A preliminary consistency check comes from Bali, which shares Java’s volcanic geology but has better archaeological survey coverage.</w:t>
+      </w:r>
+      <w:r>
+        <w:t xml:space="preserve"> </w:t>
+      </w:r>
+      <w:r>
+        <w:t xml:space="preserve">If the Two Javas model generalises, Bali’s pre-Hindu sites should cluster in non-volcanic zones, and its inscription density should exceed Java’s in proportion to reduced volcanic burial.</w:t>
       </w:r>
     </w:p>
     <w:p>
@@ -4794,7 +4904,7 @@
         <w:pStyle w:val="BodyText"/>
       </w:pPr>
       <w:r>
-        <w:t xml:space="preserve">Both predictions are confirmed.</w:t>
+        <w:t xml:space="preserve">Both expectations are met.</w:t>
       </w:r>
       <w:r>
         <w:t xml:space="preserve"> </w:t>
@@ -4806,27 +4916,7 @@
         <w:t xml:space="preserve"> </w:t>
       </w:r>
       <w:r>
-        <w:t xml:space="preserve">Bali’s inscription density per 1000 km</w:t>
-      </w:r>
-      <m:oMath>
-        <m:sSup>
-          <m:e>
-            <m:r>
-              <m:t>​</m:t>
-            </m:r>
-          </m:e>
-          <m:sup>
-            <m:r>
-              <m:t>2</m:t>
-            </m:r>
-          </m:sup>
-        </m:sSup>
-      </m:oMath>
-      <w:r>
-        <w:t xml:space="preserve"> </w:t>
-      </w:r>
-      <w:r>
-        <w:t xml:space="preserve">per century exceeds East Java’s by approximately 12-fold, closely matching the 14-fold ratio predicted by a multiplicative cascade model that accounts for volcanic burial, survey coverage, and recognition factors (Spearman</w:t>
+        <w:t xml:space="preserve">Bali’s inscription density exceeds East Java’s by approximately 12-fold, consistent with the 14-fold ratio predicted by a multiplicative cascade model (Spearman</w:t>
       </w:r>
       <w:r>
         <w:t xml:space="preserve"> </w:t>
@@ -4889,13 +4979,48 @@
         <w:t xml:space="preserve"> </w:t>
       </w:r>
       <w:r>
-        <w:t xml:space="preserve">regions including Java, Bali, Sulawesi, Philippines, and Japan).</w:t>
-      </w:r>
-      <w:r>
-        <w:t xml:space="preserve"> </w:t>
-      </w:r>
-      <w:r>
-        <w:t xml:space="preserve">All key statistical findings reported here survived bootstrap (10,000 resamples), permutation (10,000 shuffles), and leave-one-out jackknife robustness tests.</w:t>
+        <w:t xml:space="preserve">regions).</w:t>
+      </w:r>
+      <w:r>
+        <w:t xml:space="preserve"> </w:t>
+      </w:r>
+      <w:r>
+        <w:t xml:space="preserve">However, five data points producing a perfect rank correlation should be interpreted cautiously:</w:t>
+      </w:r>
+      <w:r>
+        <w:t xml:space="preserve"> </w:t>
+      </w:r>
+      <m:oMath>
+        <m:r>
+          <m:t>N</m:t>
+        </m:r>
+        <m:r>
+          <m:rPr>
+            <m:sty m:val="p"/>
+          </m:rPr>
+          <m:t>=</m:t>
+        </m:r>
+        <m:r>
+          <m:t>5</m:t>
+        </m:r>
+      </m:oMath>
+      <w:r>
+        <w:t xml:space="preserve"> </w:t>
+      </w:r>
+      <w:r>
+        <w:t xml:space="preserve">is too small for robust inference, and the observed values involve analyst estimation.</w:t>
+      </w:r>
+      <w:r>
+        <w:t xml:space="preserve"> </w:t>
+      </w:r>
+      <w:r>
+        <w:t xml:space="preserve">This result is suggestive rather than definitive, and cross-regional testing with larger samples remains a priority.</w:t>
+      </w:r>
+      <w:r>
+        <w:t xml:space="preserve"> </w:t>
+      </w:r>
+      <w:r>
+        <w:t xml:space="preserve">All key statistical findings reported in Sections 4.1–4.5 survived bootstrap (10,000 resamples), permutation (10,000 shuffles), and leave-one-out jackknife robustness tests.</w:t>
       </w:r>
     </w:p>
     <w:bookmarkEnd w:id="51"/>
@@ -4925,7 +5050,7 @@
         <w:t xml:space="preserve"> </w:t>
       </w:r>
       <w:r>
-        <w:t xml:space="preserve">But the most archaeologically productive zones—where buried sites await discovery—are in Volcano Java (0–15 km), where candi cluster and burial depths of 3–9 m conceal an unknown number of additional structures.</w:t>
+        <w:t xml:space="preserve">But the most archaeologically productive zones – where buried sites await discovery – are in Volcano Java (0–15 km), where candi cluster and burial depths of 3–9 m conceal an unknown number of additional structures.</w:t>
       </w:r>
     </w:p>
     <w:p>
@@ -4933,7 +5058,7 @@
         <w:pStyle w:val="BodyText"/>
       </w:pPr>
       <w:r>
-        <w:t xml:space="preserve">Geophysical survey methods—particularly electrical resistivity tomography (ERT) and ground-penetrating radar (GPR)—should be directed at the volcano zone, not the court zone</w:t>
+        <w:t xml:space="preserve">Geophysical survey methods – particularly electrical resistivity tomography (ERT) and ground-penetrating radar (GPR) – should be directed at the volcano zone, not the court zone</w:t>
       </w:r>
       <w:r>
         <w:t xml:space="preserve"> </w:t>
@@ -5017,13 +5142,13 @@
         <w:t xml:space="preserve"> </w:t>
       </w:r>
       <w:r>
-        <w:t xml:space="preserve">The 15 km and 30 km zone thresholds are empirically derived from the observed distribution breaks but remain arbitrary in the sense that any threshold choice excludes borderline cases.</w:t>
-      </w:r>
-      <w:r>
-        <w:t xml:space="preserve"> </w:t>
-      </w:r>
-      <w:r>
-        <w:t xml:space="preserve">Sensitivity analysis with alternative thresholds (10/25 km and 20/35 km) produces qualitatively similar results.</w:t>
+        <w:t xml:space="preserve">The 15 km and 30 km zone thresholds are grounded in volcanological hazard boundaries but remain discretisations of continuous distance gradients.</w:t>
+      </w:r>
+      <w:r>
+        <w:t xml:space="preserve"> </w:t>
+      </w:r>
+      <w:r>
+        <w:t xml:space="preserve">Sensitivity analysis with alternative thresholds (10/25 km and 20/35 km) produces qualitatively similar results: the spatial segregation of candi and inscriptions is robust across threshold choices because the underlying distributions are bimodal, not threshold-dependent.</w:t>
       </w:r>
     </w:p>
     <w:p>
@@ -5151,7 +5276,7 @@
         <w:pStyle w:val="BodyText"/>
       </w:pPr>
       <w:r>
-        <w:t xml:space="preserve">The</w:t>
+        <w:t xml:space="preserve">The textual record of the</w:t>
       </w:r>
       <w:r>
         <w:t xml:space="preserve"> </w:t>
@@ -5163,19 +5288,19 @@
         <w:t xml:space="preserve"> </w:t>
       </w:r>
       <w:r>
-        <w:t xml:space="preserve">was not a civilisation-wide transformation.</w:t>
-      </w:r>
-      <w:r>
-        <w:t xml:space="preserve"> </w:t>
-      </w:r>
-      <w:r>
-        <w:t xml:space="preserve">It was a court-zone phenomenon, 15 kilometres wide, overlaid on an indigenous landscape that never disappeared.</w:t>
-      </w:r>
-      <w:r>
-        <w:t xml:space="preserve"> </w:t>
-      </w:r>
-      <w:r>
-        <w:t xml:space="preserve">The 929 CE Mataram collapse did not destroy this landscape—it merely removed the Sanskrit overlay, allowing the indigenous substrate to become visible again.</w:t>
+        <w:t xml:space="preserve">was not a civilisation-wide phenomenon.</w:t>
+      </w:r>
+      <w:r>
+        <w:t xml:space="preserve"> </w:t>
+      </w:r>
+      <w:r>
+        <w:t xml:space="preserve">It was a court-zone product, 15 kilometres wide, overlaid on an indigenous landscape that never disappeared.</w:t>
+      </w:r>
+      <w:r>
+        <w:t xml:space="preserve"> </w:t>
+      </w:r>
+      <w:r>
+        <w:t xml:space="preserve">The 929 CE Mataram collapse did not destroy this landscape – it merely removed the Sanskrit overlay, allowing the indigenous substrate to become visible again.</w:t>
       </w:r>
       <w:r>
         <w:t xml:space="preserve"> </w:t>
@@ -5230,7 +5355,7 @@
         <w:t xml:space="preserve"> </w:t>
       </w:r>
       <w:r>
-        <w:t xml:space="preserve">The next generation of fieldwork in Java should be directed not at the well-known court plains but at the volcanic slopes where an unknown number of structures lie buried beneath metres of tephra—the sacred landscape of Volcano Java, hidden in plain sight.</w:t>
+        <w:t xml:space="preserve">The next generation of fieldwork in Java should be directed not at the well-known court plains but at the volcanic slopes where an unknown number of structures lie buried beneath metres of tephra – the sacred landscape of Volcano Java, hidden in plain sight.</w:t>
       </w:r>
     </w:p>
     <w:bookmarkStart w:id="56" w:name="data-availability"/>
@@ -5288,7 +5413,7 @@
         <w:t xml:space="preserve"> </w:t>
       </w:r>
       <w:r>
-        <w:t xml:space="preserve">The AI-augmented approach enabled the execution of 162 experiments across archaeology, volcanology, linguistics, and computational analysis.</w:t>
+        <w:t xml:space="preserve">The AI-augmented approach enabled the execution of 175 experiments across archaeology, volcanology, linguistics, and computational analysis.</w:t>
       </w:r>
       <w:r>
         <w:t xml:space="preserve"> </w:t>

</xml_diff>